<commit_message>
Paper v3: describe new Fig. 4b and update change log
Co-Authored-By: Claude Opus 5.5 <noreply@anthropic.com>
Claude-Session: https://claude.ai/code/session_01MNzwTwnHvzZnQv3nxQibjZ
</commit_message>
<xml_diff>
--- a/compound_pipeline/manuscript/Paper_Dorcas_v3_annual.docx
+++ b/compound_pipeline/manuscript/Paper_Dorcas_v3_annual.docx
@@ -330,14 +330,7 @@
         <w:jc w:val="both"/>
       </w:pPr>
       <w:r>
-        <w:rPr>
-          <w:b/>
-          <w:bCs/>
-        </w:rPr>
-        <w:t xml:space="preserve">[Describe Fig. 4b from the new figure: day of maximum density after the heatwave end and shape of the curve.]</w:t>
-      </w:r>
-      <w:r>
-        <w:t xml:space="preserve"> This pattern remains consistent across all four decades. The decrease of the ratio over time (Fig. 4c) is most pronounced in Western Africa (declining from 11.2 in 1985-1994 to 4.3 in 2015-2024), while Central Africa maintains the lowest ratios throughout (2.1 to 1.4). In every region and every decade, the ratio remains above unity, confirming that this directional asymmetry is a persistent feature of the African climate system rather than a statistical artifact of any particular period. Sensitivity tests across temporal windows from ±7 to ±60 days yield the same qualitative pattern (ratio 2.81 to 3.47; Extended Data Fig. S8), ruling out window size as a driver of the asymmetry. Because rainfall can terminate a heatwave, 7.0% of post-heatwave EPEs fall on the day after it ends; excluding EPEs within 1 to 5 days of the heatwave boundaries leaves the ratio between 3.01 and 3.16 (Extended Data Fig. S8), attesting to the robustness of the results.</w:t>
+        <w:t xml:space="preserve">The distribution of these events in time is strongly asymmetric: extreme precipitation is most likely on the first day after a heatwave ends and remains more frequent after than before heatwaves over most of the 30-day window (Fig. 4b). This pattern remains consistent across all four decades, although the peak on the first day after the heatwave has become more pronounced in the most recent decade. The decrease of the ratio over time (Fig. 4c) is most pronounced in Western Africa (declining from 11.2 in 1985-1994 to 4.3 in 2015-2024), while Central Africa maintains the lowest ratios throughout (2.1 to 1.4). In every region and every decade, the ratio remains above unity, confirming that this directional asymmetry is a persistent feature of the African climate system rather than a statistical artifact of any particular period. Sensitivity tests across temporal windows from ±7 to ±60 days yield the same qualitative pattern (ratio 2.81 to 3.47; Extended Data Fig. S8), ruling out window size as a driver of the asymmetry. Because rainfall can terminate a heatwave, 7.0% of post-heatwave EPEs fall on the day after it ends; excluding EPEs within 1 to 5 days of the heatwave boundaries leaves the ratio between 3.01 and 3.16 (Extended Data Fig. S8), attesting to the robustness of the results.</w:t>
       </w:r>
     </w:p>
     <w:p>

</xml_diff>

<commit_message>
Paper v3: tighten the Fig. 5 paragraph and remove repeated numbers in the Discussion
Co-Authored-By: Claude Opus 5.5 <noreply@anthropic.com>
Claude-Session: https://claude.ai/code/session_01MNzwTwnHvzZnQv3nxQibjZ
</commit_message>
<xml_diff>
--- a/compound_pipeline/manuscript/Paper_Dorcas_v3_annual.docx
+++ b/compound_pipeline/manuscript/Paper_Dorcas_v3_annual.docx
@@ -339,7 +339,7 @@
         <w:jc w:val="both"/>
       </w:pPr>
       <w:r>
-        <w:t xml:space="preserve">Heatwaves that follow drought conditions last longer across all regions (Fig. 5a; Extended Data Fig. S4, S8). On average, these events are extended by 0.55 days (6.45 versus 5.90 days, +9%), with the most pronounced prolongations occurring in Southern (+0.97 days, +19%) and Western Africa (+0.65 days, +11%), and the extension increases with drought severity (+7% for SPEI-3 &lt; −0.5 to +16% for SPEI-3 &lt; −2). The effect on temperature is more variable (Fig. 5b): in Southern Africa, heatwaves following drought are substantially hotter (+1.7 °C), whereas other regions exhibit more modest increases (+0.1 to +1.0 °C). This temperature difference has grown over time, from −1.8 °C in 1985-1994 to +2.1 °C in 2015-2024 at the continental scale. Concurrently, the proportion of heatwaves preceded by drought has risen sharply, increasing continent-wide from 15.5% in 1985-1994 to 34.9% in 2015-2024 (Fig. 5c). Southern Africa shows the steepest pathway, with drought-preconditioned heatwaves reaching 59.8% in the most recent decade. Part of this rise follows the background increase in drought frequency. Compared with the drought frequency expected for the same location, calendar month and decade (24.2%), heatwaves were preceded by drought 1.10 times more often (precipitation-only SPI-3: 1.08 times). This heatwave-specific excess was largest in Southern Africa (SPEI-3 ×1.17, SPI-3 ×1.28), where it reflects a genuine rainfall deficit before heatwaves (Extended Data Fig. S11).</w:t>
+        <w:t xml:space="preserve">Heatwaves preceded by drought last longer in all regions (Fig. 5a; Extended Data Figs. S4, S8): 6.45 days on average against 5.90 days for other heatwaves (+0.55 days, +9%), with the largest extensions in Southern (+0.97 days, +19%) and Western Africa (+0.65 days, +11%). The extension increases with drought severity, from +7% for SPEI-3 &lt; −0.5 to +16% for SPEI-3 &lt; −2. The effect on temperature is more variable (Fig. 5b): heatwaves preceded by drought are 1.7 °C hotter in Southern Africa but only 0.1 to 1.0 °C hotter elsewhere, and this difference has grown at the continental scale from −1.8 °C in 1985-1994 to +2.1 °C in 2015-2024. Over the same period, the share of heatwaves preceded by drought rose from 15.5% to 34.9% (Fig. 5c), reaching 59.8% in Southern Africa. Part of this rise reflects the general increase in drought frequency: relative to the frequency expected for the same location, calendar month and decade (24.2%), heatwaves were preceded by drought 1.10 times more often (SPI-3: 1.08). This excess was largest in Southern Africa (SPEI-3 ×1.17, SPI-3 ×1.28), where it reflects a genuine rainfall deficit before heatwaves (Extended Data Fig. S11).</w:t>
       </w:r>
     </w:p>
     <w:p>
@@ -723,7 +723,7 @@
         <w:t xml:space="preserve">29</w:t>
       </w:r>
       <w:r>
-        <w:t xml:space="preserve">. Our results are consistent with this process operating across tropical and subtropical African climates: heatwaves were preceded by drought more often than locally expected, most clearly in Southern Africa, where this reflects a genuine rainfall deficit. The share of heatwaves preceded by drought increased from 15.5% to 34.9% between the first and last decades of the study period, with Southern Africa reaching 59.8%. This rise, however, largely follows the increase in evaporative demand and is not found with the precipitation-only SPI, so it does not by itself demonstrate a strengthening of land-atmosphere coupling over time.</w:t>
+        <w:t xml:space="preserve">. Our results are consistent with this process operating across tropical and subtropical African climates: heatwaves were preceded by drought more often than locally expected, most clearly in Southern Africa, where this reflects a genuine rainfall deficit. The share of heatwaves preceded by drought more than doubled over the study period (Fig. 5c). This rise, however, largely follows the increase in evaporative demand and is not found with the precipitation-only SPI, so it does not by itself demonstrate a strengthening of land-atmosphere coupling over time.</w:t>
       </w:r>
     </w:p>
     <w:p>

</xml_diff>

<commit_message>
Paper v3: write 'month of the year' to avoid confusion with the calendar-day threshold
Co-Authored-By: Claude Opus 5.5 <noreply@anthropic.com>
Claude-Session: https://claude.ai/code/session_01MNzwTwnHvzZnQv3nxQibjZ
</commit_message>
<xml_diff>
--- a/compound_pipeline/manuscript/Paper_Dorcas_v3_annual.docx
+++ b/compound_pipeline/manuscript/Paper_Dorcas_v3_annual.docx
@@ -339,7 +339,7 @@
         <w:jc w:val="both"/>
       </w:pPr>
       <w:r>
-        <w:t xml:space="preserve">Heatwaves preceded by drought last longer in all regions (Fig. 5a; Extended Data Figs. S4, S8): 6.45 days on average against 5.90 days for other heatwaves (+0.55 days, +9%), with the largest extensions in Southern (+0.97 days, +19%) and Western Africa (+0.65 days, +11%). The extension increases with drought severity, from +7% for SPEI-3 &lt; −0.5 to +16% for SPEI-3 &lt; −2. The effect on temperature is more variable (Fig. 5b): heatwaves preceded by drought are 1.7 °C hotter in Southern Africa but only 0.1 to 1.0 °C hotter elsewhere, and this difference has grown at the continental scale from −1.8 °C in 1985-1994 to +2.1 °C in 2015-2024. Over the same period, the share of heatwaves preceded by drought rose from 15.5% to 34.9% (Fig. 5c), reaching 59.8% in Southern Africa. Part of this rise reflects the general increase in drought frequency: relative to the frequency expected for the same location, calendar month and decade (24.2%), heatwaves were preceded by drought 1.10 times more often (SPI-3: 1.08). This excess was largest in Southern Africa (SPEI-3 ×1.17, SPI-3 ×1.28), where it reflects a genuine rainfall deficit before heatwaves (Extended Data Fig. S11).</w:t>
+        <w:t xml:space="preserve">Heatwaves preceded by drought last longer in all regions (Fig. 5a; Extended Data Figs. S4, S8): 6.45 days on average against 5.90 days for other heatwaves (+0.55 days, +9%), with the largest extensions in Southern (+0.97 days, +19%) and Western Africa (+0.65 days, +11%). The extension increases with drought severity, from +7% for SPEI-3 &lt; −0.5 to +16% for SPEI-3 &lt; −2. The effect on temperature is more variable (Fig. 5b): heatwaves preceded by drought are 1.7 °C hotter in Southern Africa but only 0.1 to 1.0 °C hotter elsewhere, and this difference has grown at the continental scale from −1.8 °C in 1985-1994 to +2.1 °C in 2015-2024. Over the same period, the share of heatwaves preceded by drought rose from 15.5% to 34.9% (Fig. 5c), reaching 59.8% in Southern Africa. Part of this rise reflects the general increase in drought frequency: relative to the frequency expected for the same location, month of the year and decade (24.2%), heatwaves were preceded by drought 1.10 times more often (SPI-3: 1.08). This excess was largest in Southern Africa (SPEI-3 ×1.17, SPI-3 ×1.28), where it reflects a genuine rainfall deficit before heatwaves (Extended Data Fig. S11).</w:t>
       </w:r>
     </w:p>
     <w:p>
@@ -1022,7 +1022,7 @@
         <w:t xml:space="preserve">39</w:t>
       </w:r>
       <w:r>
-        <w:t xml:space="preserve">. The monthly climatic water balance, D = P − PET, was accumulated over a rolling 3-month window. For each PSU and calendar month, a log-logistic distribution was fitted by maximum likelihood to the 1985-2014 values with xclim 0.61.1</w:t>
+        <w:t xml:space="preserve">. The monthly climatic water balance, D = P − PET, was accumulated over a rolling 3-month window. For each PSU and month of the year, a log-logistic distribution was fitted by maximum likelihood to the 1985-2014 values with xclim 0.61.1</w:t>
       </w:r>
       <w:r>
         <w:rPr>
@@ -1156,7 +1156,7 @@
         <w:t xml:space="preserve">Drought-preconditioned heatwaves.</w:t>
       </w:r>
       <w:r>
-        <w:t xml:space="preserve"> We linked each heatwave to the SPEI-3 value of the month preceding its onset month at the corresponding PSU, which avoids the onset month, whose evaporative demand is inflated by the heatwave itself. Heatwaves preceded by SPEI-3 &lt; −1 were classified as drought-preconditioned. For each region, we compared the duration and peak intensity (maximum Tmax) of these drought-preconditioned heatwaves against the other heatwaves to assess how drought conditions modify heatwave characteristics. Sensitivity analyses used the onset month (lag 0), SPI-3 and drought thresholds of −0.5, −1.5 and −2. Because drought frequency differs between places and seasons, the observed share was also compared with its local expectation, the drought frequency of the same PSU in the same calendar month and decade.</w:t>
+        <w:t xml:space="preserve"> We linked each heatwave to the SPEI-3 value of the month preceding its onset month at the corresponding PSU, which avoids the onset month, whose evaporative demand is inflated by the heatwave itself. Heatwaves preceded by SPEI-3 &lt; −1 were classified as drought-preconditioned. For each region, we compared the duration and peak intensity (maximum Tmax) of these drought-preconditioned heatwaves against the other heatwaves to assess how drought conditions modify heatwave characteristics. Sensitivity analyses used the onset month (lag 0), SPI-3 and drought thresholds of −0.5, −1.5 and −2. Because drought frequency differs between places and seasons, the observed share was also compared with its local expectation, the drought frequency of the same PSU in the same month of the year and decade.</w:t>
       </w:r>
     </w:p>
     <w:p>
@@ -2024,7 +2024,7 @@
         <w:t xml:space="preserve">Extended Data Fig. S11 | Drought before heatwaves compared with the local expectation.</w:t>
       </w:r>
       <w:r>
-        <w:t xml:space="preserve"> Observed share of heatwaves preceded by drought and share expected from the drought frequency of the same PSU, calendar month and decade, for SPEI-3 and SPI-3 (continental ratio 1.10 and 1.08; Southern Africa 1.17 and 1.28).</w:t>
+        <w:t xml:space="preserve"> Observed share of heatwaves preceded by drought and share expected from the drought frequency of the same PSU, month of the year and decade, for SPEI-3 and SPI-3 (continental ratio 1.10 and 1.08; Southern Africa 1.17 and 1.28).</w:t>
       </w:r>
     </w:p>
     <w:p>

</xml_diff>

<commit_message>
Fig S8d: show duration extension in percent; cite panels and add Supplementary Table S4
Co-Authored-By: Claude Opus 5.5 <noreply@anthropic.com>
Claude-Session: https://claude.ai/code/session_01MNzwTwnHvzZnQv3nxQibjZ
</commit_message>
<xml_diff>
--- a/compound_pipeline/manuscript/Paper_Dorcas_v3_annual.docx
+++ b/compound_pipeline/manuscript/Paper_Dorcas_v3_annual.docx
@@ -330,16 +330,16 @@
         <w:jc w:val="both"/>
       </w:pPr>
       <w:r>
-        <w:t xml:space="preserve">Extreme precipitation is most likely on the first day after a heatwave ends and remains more frequent after than before heatwaves over most of the 30-day window (Fig. 4b). This peak is consistent with rainfall terminating some heatwaves: 7.0% of post-heatwave EPEs fall on the day after the heatwave ends. Excluding EPEs within 1 to 5 days of the heatwave boundaries nevertheless leaves the ratio between 3.01 and 3.16, and windows from ±7 to ±60 days give ratios of 2.81 to 3.47 (Extended Data Fig. S8). The shape of the distribution is similar in all four decades, although the peak on the first day has become more pronounced in 2015-2024. Across regions (Fig. 4c), the decline of the ratio is steepest in Western Africa (from 11.2 in 1985-1994 to 4.3 in 2015-2024), while Central Africa has the lowest ratios throughout (2.1 to 1.4).</w:t>
-      </w:r>
-    </w:p>
-    <w:p>
-      <w:pPr>
-        <w:spacing w:after="160"/>
-        <w:jc w:val="both"/>
-      </w:pPr>
-      <w:r>
-        <w:t xml:space="preserve">Heatwaves preceded by drought last longer in all regions (Fig. 5a; Extended Data Figs. S4, S8): 6.45 days on average against 5.90 days for other heatwaves (+0.55 days, +9%), with the largest extensions in Southern (+0.97 days, +19%) and Western Africa (+0.65 days, +11%). The extension increases with drought severity, from +7% for SPEI-3 &lt; −0.5 to +16% for SPEI-3 &lt; −2. The effect on temperature is more variable (Fig. 5b): heatwaves preceded by drought are 1.7 °C hotter in Southern Africa but only 0.1 to 1.0 °C hotter elsewhere, and this difference has grown at the continental scale from −1.8 °C in 1985-1994 to +2.1 °C in 2015-2024. Over the same period, the share of heatwaves preceded by drought rose from 15.5% to 34.9% (Fig. 5c), reaching 59.8% in Southern Africa. Part of this rise reflects the general increase in drought frequency: relative to the frequency expected for the same location, month of the year and decade (24.2%), heatwaves were preceded by drought 1.10 times more often (SPI-3: 1.08). This excess was largest in Southern Africa (SPEI-3 ×1.17, SPI-3 ×1.28), where it reflects a genuine rainfall deficit before heatwaves (Extended Data Fig. S11).</w:t>
+        <w:t xml:space="preserve">Extreme precipitation is most likely on the first day after a heatwave ends and remains more frequent after than before heatwaves over most of the 30-day window (Fig. 4b). This peak is consistent with rainfall terminating some heatwaves: 7.0% of post-heatwave EPEs fall on the day after the heatwave ends. Excluding EPEs within 1 to 5 days of the heatwave boundaries nevertheless leaves the ratio between 3.01 and 3.16, and windows from ±7 to ±60 days give ratios of 2.81 to 3.47 (Extended Data Fig. S8a,b; Supplementary Table S4). The shape of the distribution is similar in all four decades, although the peak on the first day has become more pronounced in 2015-2024. Across regions (Fig. 4c), the decline of the ratio is steepest in Western Africa (from 11.2 in 1985-1994 to 4.3 in 2015-2024), while Central Africa has the lowest ratios throughout (2.1 to 1.4).</w:t>
+      </w:r>
+    </w:p>
+    <w:p>
+      <w:pPr>
+        <w:spacing w:after="160"/>
+        <w:jc w:val="both"/>
+      </w:pPr>
+      <w:r>
+        <w:t xml:space="preserve">Heatwaves preceded by drought last longer in all regions (Fig. 5a; Extended Data Fig. S4): 6.45 days on average against 5.90 days for other heatwaves (+0.55 days, +9%), with the largest extensions in Southern (+0.97 days, +19%) and Western Africa (+0.65 days, +11%). The extension increases with drought severity, from +7% for SPEI-3 &lt; −0.5 to +16% for SPEI-3 &lt; −2 (Extended Data Fig. S8d). The effect on temperature is more variable (Fig. 5b): heatwaves preceded by drought are 1.7 °C hotter in Southern Africa but only 0.1 to 1.0 °C hotter elsewhere, and this difference has grown at the continental scale from −1.8 °C in 1985-1994 to +2.1 °C in 2015-2024. Over the same period, the share of heatwaves preceded by drought rose from 15.5% to 34.9% (Fig. 5c), reaching 59.8% in Southern Africa. Part of this rise reflects the general increase in drought frequency: relative to the frequency expected for the same location, month of the year and decade (24.2%), heatwaves were preceded by drought 1.10 times more often (SPI-3: 1.08). This excess was largest in Southern Africa (SPEI-3 ×1.17, SPI-3 ×1.28), where it reflects a genuine rainfall deficit before heatwaves (Extended Data Fig. S11).</w:t>
       </w:r>
     </w:p>
     <w:p>
@@ -1976,7 +1976,57 @@
         <w:t xml:space="preserve">Extended Data Fig. S8 | Sensitivity analysis.</w:t>
       </w:r>
       <w:r>
-        <w:t xml:space="preserve"> Effect of the drought threshold (−0.5 to −2) on the share of heatwaves preceded by drought (42.5% to 5.7%), on the duration ratio (1.07 to 1.16) and on the trend; after-to-before ratio for windows of ±7 to ±60 days (2.81 to 3.47); and ratio after excluding EPEs within 1 to 5 days of the heatwave boundaries (3.01 to 3.16).</w:t>
+        <w:t xml:space="preserve"> </w:t>
+      </w:r>
+      <w:r>
+        <w:rPr>
+          <w:b/>
+          <w:bCs/>
+        </w:rPr>
+        <w:t xml:space="preserve">a</w:t>
+      </w:r>
+      <w:r>
+        <w:t xml:space="preserve">, After-to-before ratio of extreme precipitation for windows of ±7 to ±60 days, by region. </w:t>
+      </w:r>
+      <w:r>
+        <w:rPr>
+          <w:b/>
+          <w:bCs/>
+        </w:rPr>
+        <w:t xml:space="preserve">b</w:t>
+      </w:r>
+      <w:r>
+        <w:t xml:space="preserve">, Same for the continent (2.81 to 3.47). </w:t>
+      </w:r>
+      <w:r>
+        <w:rPr>
+          <w:b/>
+          <w:bCs/>
+        </w:rPr>
+        <w:t xml:space="preserve">c</w:t>
+      </w:r>
+      <w:r>
+        <w:t xml:space="preserve">, Share of heatwaves preceded by drought for SPEI-3 thresholds from −0.5 to −2 (42.5% to 5.7%). </w:t>
+      </w:r>
+      <w:r>
+        <w:rPr>
+          <w:b/>
+          <w:bCs/>
+        </w:rPr>
+        <w:t xml:space="preserve">d</w:t>
+      </w:r>
+      <w:r>
+        <w:t xml:space="preserve">, Extension of the mean duration of heatwaves preceded by drought relative to other heatwaves, for the same thresholds (+7% to +16%). </w:t>
+      </w:r>
+      <w:r>
+        <w:rPr>
+          <w:b/>
+          <w:bCs/>
+        </w:rPr>
+        <w:t xml:space="preserve">e</w:t>
+      </w:r>
+      <w:r>
+        <w:t xml:space="preserve">, Share of heatwaves preceded by drought with SPEI-3 in the preceding month (primary), SPEI-3 in the month of onset and SPI-3, by region. The ratio after excluding EPEs near the heatwave boundaries and the drought-share trend for each threshold are given in Supplementary Table S4.</w:t>
       </w:r>
     </w:p>
     <w:p>
@@ -2099,6 +2149,22 @@
           <w:bCs/>
         </w:rPr>
         <w:t xml:space="preserve">Supplementary Table S3 | Likelihood multiplication factor by region.</w:t>
+      </w:r>
+    </w:p>
+    <w:p>
+      <w:pPr>
+        <w:spacing w:after="160"/>
+        <w:jc w:val="both"/>
+      </w:pPr>
+      <w:r>
+        <w:rPr>
+          <w:b/>
+          <w:bCs/>
+        </w:rPr>
+        <w:t xml:space="preserve">Supplementary Table S4 | Sensitivity values.</w:t>
+      </w:r>
+      <w:r>
+        <w:t xml:space="preserve"> After-to-before ratio after excluding EPEs within 1 to 5 days of the heatwave boundaries (3.01 to 3.16); for each SPEI-3 threshold, share of heatwaves preceded by drought, duration ratio and trend of this share per decade.</w:t>
       </w:r>
     </w:p>
     <w:sectPr>

</xml_diff>

<commit_message>
Methods v3: restore PET formula and SPEI details, state gamma distribution for SPI
Co-Authored-By: Claude Opus 5.5 <noreply@anthropic.com>
Claude-Session: https://claude.ai/code/session_01MNzwTwnHvzZnQv3nxQibjZ
</commit_message>
<xml_diff>
--- a/compound_pipeline/manuscript/Paper_Dorcas_v3_annual.docx
+++ b/compound_pipeline/manuscript/Paper_Dorcas_v3_annual.docx
@@ -954,7 +954,7 @@
         <w:t xml:space="preserve">2,23</w:t>
       </w:r>
       <w:r>
-        <w:t xml:space="preserve">. For each detected heatwave, we recorded the start and end dates, total duration (days), and peak Tmax. In total, 10,743,161 heatwaves were detected. As a sensitivity analysis, heatwaves were also defined with a calendar-day threshold, computed for each calendar day from the baseline values within a 31-day window centred on that day.</w:t>
+        <w:t xml:space="preserve">. For each detected heatwave, we recorded the start and end dates, total duration (days), mean Tmax across the heatwave days, and peak Tmax. In total, 10,743,161 heatwaves were detected. As a sensitivity analysis, heatwaves were also defined with a calendar-day threshold, computed for each calendar day from the baseline values within a 31-day window centred on that day.</w:t>
       </w:r>
     </w:p>
     <w:p>
@@ -1013,7 +1013,31 @@
         <w:t xml:space="preserve">38</w:t>
       </w:r>
       <w:r>
-        <w:t xml:space="preserve">, recommended by the FAO when only temperature data are available, with extraterrestrial radiation computed following FAO Irrigation and Drainage Paper 56</w:t>
+        <w:t xml:space="preserve">. This method is recommended by the FAO when only temperature data are available, and it remains numerically stable in tropical regions where temperature-based alternatives (such as the Thornthwaite equation) diverge at sustained temperatures above ~26 °C:</w:t>
+      </w:r>
+    </w:p>
+    <w:p>
+      <w:pPr>
+        <w:spacing w:after="160"/>
+        <w:jc w:val="both"/>
+      </w:pPr>
+      <w:r>
+        <w:t xml:space="preserve">PET = 0.0023 × 0.408 × Ra × (Tmean + 17.8) × (Tmax − Tmin)</w:t>
+      </w:r>
+      <w:r>
+        <w:rPr>
+          <w:vertAlign w:val="superscript"/>
+        </w:rPr>
+        <w:t xml:space="preserve">0.5</w:t>
+      </w:r>
+    </w:p>
+    <w:p>
+      <w:pPr>
+        <w:spacing w:after="160"/>
+        <w:jc w:val="both"/>
+      </w:pPr>
+      <w:r>
+        <w:t xml:space="preserve">where Ra is extraterrestrial radiation (MJ m⁻² d⁻¹) computed as a function of latitude and day of the year following FAO Irrigation and Drainage Paper 56</w:t>
       </w:r>
       <w:r>
         <w:rPr>
@@ -1022,7 +1046,7 @@
         <w:t xml:space="preserve">39</w:t>
       </w:r>
       <w:r>
-        <w:t xml:space="preserve">. The monthly climatic water balance, D = P − PET, was accumulated over a rolling 3-month window. For each PSU and month of the year, a log-logistic distribution was fitted by maximum likelihood to the 1985-2014 values with xclim 0.61.1</w:t>
+        <w:t xml:space="preserve"> (solar constant Gsc = 0.0820 MJ m⁻² min⁻¹), Tmean = (Tmax + Tmin) / 2, and the factor 0.408 converts MJ m⁻² to millimetres of water evaporated. We calculated monthly PET by applying the formula to monthly mean values of Tmax, Tmin and Ra and multiplying by the number of days in the month. The monthly climatic water balance, D = P − PET, was then accumulated over a rolling 3-month window. For each PSU and month of the year, a log-logistic distribution was fitted by maximum likelihood to the 1985-2014 values with xclim 0.61.1</w:t>
       </w:r>
       <w:r>
         <w:rPr>
@@ -1031,7 +1055,7 @@
         <w:t xml:space="preserve">40</w:t>
       </w:r>
       <w:r>
-        <w:t xml:space="preserve">, so that values after 2014 are extrapolations beyond the calibration period. The 3-month Standardized Precipitation Index (SPI-3)</w:t>
+        <w:t xml:space="preserve">, so that values after 2014 are extrapolations beyond the calibration period. We applied the cumulative distribution function to the full series and transformed the resulting probabilities into SPEI values using the inverse standard normal function, clipping values beyond ±3.5. As a comparison, the 3-month Standardized Precipitation Index (SPI-3)</w:t>
       </w:r>
       <w:r>
         <w:rPr>
@@ -1040,7 +1064,7 @@
         <w:t xml:space="preserve">41</w:t>
       </w:r>
       <w:r>
-        <w:t xml:space="preserve">, based on precipitation only, was computed in the same way as a comparison. A PSU-month was classified as experiencing drought when the index was below −1, corresponding to at least moderate drought severity</w:t>
+        <w:t xml:space="preserve">, based on precipitation only, was computed in the same way with a gamma distribution. A PSU-month was classified as experiencing drought when the index was below −1, corresponding to at least moderate drought severity</w:t>
       </w:r>
       <w:r>
         <w:rPr>

</xml_diff>

<commit_message>
Paper v3: Fig. 6 results, discussion, legend and methods with the new regimes; sensitivity analyses paragraph
Co-Authored-By: Claude Opus 5.5 <noreply@anthropic.com>
Claude-Session: https://claude.ai/code/session_01MNzwTwnHvzZnQv3nxQibjZ
</commit_message>
<xml_diff>
--- a/compound_pipeline/manuscript/Paper_Dorcas_v3_annual.docx
+++ b/compound_pipeline/manuscript/Paper_Dorcas_v3_annual.docx
@@ -348,26 +348,16 @@
         <w:jc w:val="both"/>
       </w:pPr>
       <w:r>
-        <w:t xml:space="preserve">Classification of PSU by their dominant compound event combinations reveals that most locations across sub-Saharan Africa are exposed to at most one prominent hazard type (Fig. 6). Of the 35,533 locations with sufficient data to be classified (66% of eligible clusters; most of the others lie in the western Sahel, where few extreme-precipitation events surround heatwaves), 37.7% had no prominent event type (Fig. 6a). Single-hazard regimes were the most common otherwise: isolated post-heatwave precipitation excess (18.4%), heat-precipitation events alone (18.0%) and drought-heat events alone (14.6%). The combination of drought-heat coupling and post-heatwave precipitation excess represents 5.4%, the pairing of heat-precipitation events with drought-heat coupling 4.8%, while heat-precipitation events with post-heatwave precipitation excess (1.0%) and the overlap of all three types (0.1%) constitute the least frequent categories.</w:t>
-      </w:r>
-    </w:p>
-    <w:p>
-      <w:pPr>
-        <w:spacing w:after="160"/>
-        <w:jc w:val="both"/>
-      </w:pPr>
-      <w:r>
-        <w:t xml:space="preserve">These regimes exhibit strong geographical variation (Fig. 6b): in Western and Southern Africa, drought-heat events dominate, reflecting dry baseline conditions. In contrast, Eastern Africa shows the highest spatial overlap of all three event types, consistent with its high background moisture availability, recurring droughts, and strong post-heatwave rainfall response. </w:t>
-      </w:r>
-      <w:r>
-        <w:rPr>
-          <w:b/>
-          <w:bCs/>
-        </w:rPr>
-        <w:t xml:space="preserve">[Check both sentences against the new Fig. 6b.]</w:t>
-      </w:r>
-      <w:r>
-        <w:t xml:space="preserve"> Over time, regimes dominated by heat-precipitation co-occurrence expanded (from 13.9% of classifiable locations in 1985-1994 to 35.5% in 2015-2024, and from 6.3% to 20.7% when combined with drought-heat coupling), whereas post-heatwave precipitation excess alone became less frequent (17.5% to 6.1%). At individual locations, however, the regime was unchanged in only 20.3% of the 15,644 locations classifiable in both decades (16.1% expected by chance), so these changes describe a net redistribution rather than stable local trajectories. The same patterns were found when the upper tercile was used as threshold (Extended Data Fig. S13).</w:t>
+        <w:t xml:space="preserve">Classification of PSU by their dominant compound event combinations reveals that most locations across sub-Saharan Africa are exposed to at most one prominent hazard type (Fig. 6). Of the 51,514 locations with sufficient data to be classified (94.3% of the 54,615 clusters; the remaining 5.7% had no extreme precipitation event around heatwaves or no valid climate data), 39.5% had no prominent event type (Fig. 6a), close to the 43.8% expected if the three types were spatially independent. Single-hazard regimes were the most common otherwise: heat-precipitation events alone (17.5%), isolated post-heatwave precipitation excess (16.7%) and drought-heat events alone (14.7%). The combination of drought-heat coupling and post-heatwave precipitation excess represents 6.8%, more than expected under independence (4.8%), consistent with a sequence of dry conditions, heat and subsequent rainfall. By contrast, heat-precipitation events rarely coincide with post-heatwave precipitation excess (1.4%, against 4.2% expected) or with both other types (0.1%, against 1.4% expected), and their pairing with drought-heat coupling represents 3.3%.</w:t>
+      </w:r>
+    </w:p>
+    <w:p>
+      <w:pPr>
+        <w:spacing w:after="160"/>
+        <w:jc w:val="both"/>
+      </w:pPr>
+      <w:r>
+        <w:t xml:space="preserve">These regimes exhibit strong geographical variation (Fig. 6b). Post-heatwave precipitation excess dominates the Sahel, where heatwaves occur at the end of the dry season, and is frequently combined with drought-heat coupling in its western part. Same-day heat-precipitation events dominate in more humid settings, including Madagascar, the East African highlands and the Atlantic coast of Central Africa, and are combined with drought-heat coupling in parts of the Congo Basin and of south-eastern Africa. The near absence of locations where all three types are prominent indicates that these hazards occupy distinct climatic settings rather than accumulating in the same places. With the same 1985-2024 thresholds, the share of locations without any prominent type fell from 64.6% in 1985-1994 to 24.6% in 2015-2024 (Fig. 6c–e). Drought-heat coupling alone became the most frequent regime (from 10.2% to 28.1%), followed by heat-precipitation events alone (7.8% to 23.3%) and their combination (2.2% to 12.4%), whereas post-heatwave precipitation excess alone became less frequent (12.8% to 5.3%). At individual locations, the regime was unchanged in 22.2% of the 42,234 locations classifiable in both decades, barely more than expected by chance (20.5%), so these changes describe a net redistribution rather than stable local trajectories (Fig. 6f). The same patterns were found with the upper tercile as threshold and with a minimum of 10 extreme precipitation events per location (Extended Data Fig. S13).</w:t>
       </w:r>
     </w:p>
     <w:p>
@@ -632,7 +622,7 @@
         <w:t xml:space="preserve">a</w:t>
       </w:r>
       <w:r>
-        <w:t xml:space="preserve">, Distribution of the 35,533 classifiable survey clusters across eight mutually exclusive regimes, defined by which event types are locally prominent using fixed thresholds for each event type (upper quartile; Methods). </w:t>
+        <w:t xml:space="preserve">, Distribution of the 51,514 classifiable survey clusters across eight mutually exclusive regimes, defined by which event types are locally prominent (value above the 75th percentile of all classifiable clusters, 1985-2024; Methods). </w:t>
       </w:r>
       <w:r>
         <w:rPr>
@@ -642,7 +632,67 @@
         <w:t xml:space="preserve">b</w:t>
       </w:r>
       <w:r>
-        <w:t xml:space="preserve">, Spatial distribution of these regimes; clusters with insufficient data are shown separately. Categories denote local co-prominence of independently defined metrics and are descriptive; they do not imply physical coupling between event types.</w:t>
+        <w:t xml:space="preserve">, Spatial distribution of these regimes; clusters with insufficient data are shown in dark grey. </w:t>
+      </w:r>
+      <w:r>
+        <w:rPr>
+          <w:b/>
+          <w:bCs/>
+        </w:rPr>
+        <w:t xml:space="preserve">c</w:t>
+      </w:r>
+      <w:r>
+        <w:t xml:space="preserve">, Share of each regime by decade, with the 1985-2024 thresholds. </w:t>
+      </w:r>
+      <w:r>
+        <w:rPr>
+          <w:b/>
+          <w:bCs/>
+        </w:rPr>
+        <w:t xml:space="preserve">d</w:t>
+      </w:r>
+      <w:r>
+        <w:t xml:space="preserve">, </w:t>
+      </w:r>
+      <w:r>
+        <w:rPr>
+          <w:b/>
+          <w:bCs/>
+        </w:rPr>
+        <w:t xml:space="preserve">e</w:t>
+      </w:r>
+      <w:r>
+        <w:t xml:space="preserve">, Regimes in 1985-1994 (</w:t>
+      </w:r>
+      <w:r>
+        <w:rPr>
+          <w:b/>
+          <w:bCs/>
+        </w:rPr>
+        <w:t xml:space="preserve">d</w:t>
+      </w:r>
+      <w:r>
+        <w:t xml:space="preserve">) and 2015-2024 (</w:t>
+      </w:r>
+      <w:r>
+        <w:rPr>
+          <w:b/>
+          <w:bCs/>
+        </w:rPr>
+        <w:t xml:space="preserve">e</w:t>
+      </w:r>
+      <w:r>
+        <w:t xml:space="preserve">). </w:t>
+      </w:r>
+      <w:r>
+        <w:rPr>
+          <w:b/>
+          <w:bCs/>
+        </w:rPr>
+        <w:t xml:space="preserve">f</w:t>
+      </w:r>
+      <w:r>
+        <w:t xml:space="preserve">, Transitions between the first and last decades for the 42,234 clusters classifiable in both (% of clusters; outlined cells mark unchanged regimes). Categories denote local co-prominence of independently defined metrics and are descriptive; they do not imply physical coupling between event types.</w:t>
       </w:r>
     </w:p>
     <w:p>
@@ -768,17 +818,7 @@
         <w:jc w:val="both"/>
       </w:pPr>
       <w:r>
-        <w:t xml:space="preserve">The regional differences observed in these compound events are important for climate-risk assessment. Hazard combinations vary across sub-Saharan Africa: drought-heat events are particularly common in Western and Southern Africa, whereas Eastern Africa experiences the greatest overlap between different types of compound events. </w:t>
-      </w:r>
-      <w:r>
-        <w:rPr>
-          <w:b/>
-          <w:bCs/>
-        </w:rPr>
-        <w:t xml:space="preserve">[Check against the new Fig. 6b.]</w:t>
-      </w:r>
-      <w:r>
-        <w:t xml:space="preserve"> This diversity indicates that climate risks cannot be fully understood by considering hazards in isolation.</w:t>
+        <w:t xml:space="preserve">The regional differences observed in these compound events are important for climate-risk assessment. Hazard combinations vary across sub-Saharan Africa: post-heatwave precipitation excess, often together with drought-heat coupling, characterizes the Sahel, whereas same-day heat-precipitation events characterize more humid regions such as Madagascar and the East African highlands, and the three types almost never coincide at the same location. The rapid expansion of regimes dominated by drought-heat coupling and heat-precipitation co-occurrence over the past four decades shows that exposure is changing in type as well as in frequency. This diversity indicates that climate risks cannot be fully understood by considering hazards in isolation.</w:t>
       </w:r>
     </w:p>
     <w:p>
@@ -832,7 +872,7 @@
         <w:jc w:val="both"/>
       </w:pPr>
       <w:r>
-        <w:t xml:space="preserve">Overall, our results demonstrate that compound climate events in sub-Saharan Africa are increasing in frequency and spatial extent, with a net shift towards regimes dominated by heat-precipitation co-occurrence, while sequences of drought, heat and subsequent rainfall remain a persistent feature of the subtropics. These dynamics carry direct implications for early-warning systems, as these systems remain largely based on single-hazard thresholds, they are ill-equipped to anticipate the combined interactions highlighted in this study. Integrating compound-hazard indicators into existing frameworks therefore represents an urgent and feasible adaptation priority. More broadly, this work provides an empirical foundation for a new generation of climate and risk assessments that moves beyond single-exposure paradigms to quantify the joint and sequential effects of heat, extreme precipitation and drought on child survival, nutrition and infectious disease, precisely the populations and issues where compound risks are likely to have the greatest impact.</w:t>
+        <w:t xml:space="preserve">Overall, our results demonstrate that compound climate events in sub-Saharan Africa are increasing in frequency and spatial extent, with a net shift from locations without any prominent hazard towards regimes dominated by drought-heat coupling and heat-precipitation co-occurrence, while sequences of drought, heat and subsequent rainfall remain a persistent feature of the subtropics. These dynamics carry direct implications for early-warning systems, as these systems remain largely based on single-hazard thresholds, they are ill-equipped to anticipate the combined interactions highlighted in this study. Integrating compound-hazard indicators into existing frameworks therefore represents an urgent and feasible adaptation priority. More broadly, this work provides an empirical foundation for a new generation of climate and risk assessments that moves beyond single-exposure paradigms to quantify the joint and sequential effects of heat, extreme precipitation and drought on child survival, nutrition and infectious disease, precisely the populations and issues where compound risks are likely to have the greatest impact.</w:t>
       </w:r>
     </w:p>
     <w:p>
@@ -954,7 +994,7 @@
         <w:t xml:space="preserve">2,23</w:t>
       </w:r>
       <w:r>
-        <w:t xml:space="preserve">. For each detected heatwave, we recorded the start and end dates, total duration (days), mean Tmax across the heatwave days, and peak Tmax. In total, 10,743,161 heatwaves were detected. As a sensitivity analysis, heatwaves were also defined with a calendar-day threshold, computed for each calendar day from the baseline values within a 31-day window centred on that day.</w:t>
+        <w:t xml:space="preserve">. For each detected heatwave, we recorded the start and end dates, total duration (days), mean Tmax across the heatwave days, and peak Tmax. In total, 10,743,161 heatwaves were detected.</w:t>
       </w:r>
     </w:p>
     <w:p>
@@ -1164,7 +1204,7 @@
         <w:t xml:space="preserve">Seasonally constrained null model.</w:t>
       </w:r>
       <w:r>
-        <w:t xml:space="preserve"> Because heat and rainfall both follow seasonal cycles, an after-to-before asymmetry can arise from the timing of heatwaves relative to the rainy season alone. In each of 1,000 permutations, every heatwave kept its PSU and its duration, and its onset was moved to the same time of year in another year, with a random shift of up to ±15 days, provided that its ±30-day window stayed within the study period and did not overlap the observed heatwave. PSUs in the same ERA5 cell share identical heatwaves; one draw was made per distinct heatwave and applied to all PSUs of that cell. Surrogate heatwaves were processed with the same attribution procedure as observed ones. We report the observed ratio, the median and 2.5–97.5 percentile envelope of the null, and the ratio of the observed value to the null median, for the continent, each region and each season of heatwave onset. The numbers of EPEs before and after surrogate heatwaves decompose the asymmetry into a deficit before heatwaves and an excess after them. The analysis is descriptive; it controls for location and seasonality but not for interannual variability. We also repeated the calculation with windows of 7, 15, 45 and 60 days and after excluding EPEs within 1 to 5 days of the heatwave boundaries.</w:t>
+        <w:t xml:space="preserve"> Because heat and rainfall both follow seasonal cycles, an after-to-before asymmetry can arise from the timing of heatwaves relative to the rainy season alone. In each of 1,000 permutations, every heatwave kept its PSU and its duration, and its onset was moved to the same time of year in another year, with a random shift of up to ±15 days, provided that its ±30-day window stayed within the study period and did not overlap the observed heatwave. PSUs in the same ERA5 cell share identical heatwaves; one draw was made per distinct heatwave and applied to all PSUs of that cell. Surrogate heatwaves were processed with the same attribution procedure as observed ones. We report the observed ratio, the median and 2.5–97.5 percentile envelope of the null, and the ratio of the observed value to the null median, for the continent, each region and each season of heatwave onset. The numbers of EPEs before and after surrogate heatwaves decompose the asymmetry into a deficit before heatwaves and an excess after them. The analysis is descriptive; it controls for location and seasonality but not for interannual variability.</w:t>
       </w:r>
     </w:p>
     <w:p>
@@ -1180,7 +1220,7 @@
         <w:t xml:space="preserve">Drought-preconditioned heatwaves.</w:t>
       </w:r>
       <w:r>
-        <w:t xml:space="preserve"> We linked each heatwave to the SPEI-3 value of the month preceding its onset month at the corresponding PSU, which avoids the onset month, whose evaporative demand is inflated by the heatwave itself. Heatwaves preceded by SPEI-3 &lt; −1 were classified as drought-preconditioned. For each region, we compared the duration and peak intensity (maximum Tmax) of these drought-preconditioned heatwaves against the other heatwaves to assess how drought conditions modify heatwave characteristics. Sensitivity analyses used the onset month (lag 0), SPI-3 and drought thresholds of −0.5, −1.5 and −2. Because drought frequency differs between places and seasons, the observed share was also compared with its local expectation, the drought frequency of the same PSU in the same month of the year and decade.</w:t>
+        <w:t xml:space="preserve"> We linked each heatwave to the SPEI-3 value of the month preceding its onset month at the corresponding PSU, which avoids the onset month, whose evaporative demand is inflated by the heatwave itself. Heatwaves preceded by SPEI-3 &lt; −1 were classified as drought-preconditioned. For each region, we compared the duration and peak intensity (maximum Tmax) of these drought-preconditioned heatwaves against the other heatwaves to assess how drought conditions modify heatwave characteristics. Because drought frequency differs between places and seasons, the observed share was also compared with its local expectation, the drought frequency of the same PSU in the same month of the year and decade.</w:t>
       </w:r>
     </w:p>
     <w:p>
@@ -1257,7 +1297,63 @@
         <w:t xml:space="preserve">Compound-hazard regimes.</w:t>
       </w:r>
       <w:r>
-        <w:t xml:space="preserve"> Each PSU was classified according to which event types are locally prominent: an event type is prominent when its PSU value is strictly above the 75th percentile of the PSUs classifiable on all three types over 1985-2024, which yields eight mutually exclusive regimes; the upper tercile was used as a sensitivity threshold. A PSU was classifiable only if at least 10 EPEs were attributed to its heatwaves and at least 10 of its heatwaves had an antecedent SPEI-3 value; these minimum supports were fixed from the distribution of supports before thresholds or classes were examined. Decadal regimes apply the same 1985-2024 thresholds, and transitions between the first and last decades were computed on the PSUs classifiable in both, the share of PSUs keeping the same regime being compared with its value expected by chance.</w:t>
+        <w:t xml:space="preserve"> Because the three event types are measured in different units (days per year, a ratio and a percentage), locations were classified with a relative rule rather than with absolute thresholds, which preserves comparability across event types. For each type, a PSU was considered prominent when its 1985-2024 value was strictly above the 75th percentile of all classifiable PSUs, so that each type is prominent in about one quarter of locations; the three outcomes define eight mutually exclusive regimes. For the sequential type, the after-to-before ratio was computed with 0.5 added to both counts (Haldane-Anscombe correction), so that it remains defined where no extreme precipitation preceded heatwaves and is not inflated where events are very few. PSUs without any extreme precipitation event around heatwaves, or without a heatwave with an SPEI-3 value, were labelled as having insufficient data. The share of each regime was compared with its expectation if the three types were spatially independent, computed as the product of the observed shares of prominent or non-prominent PSUs for each type. Decadal regimes apply the same 1985-2024 thresholds, so that changes reflect changes in the underlying metrics; transitions between the first and last decades were computed on the PSUs classifiable in both, and the share of PSUs keeping the same regime was compared with its value expected by chance. The classification is descriptive and does not imply physical coupling between event types.</w:t>
+      </w:r>
+    </w:p>
+    <w:p>
+      <w:pPr>
+        <w:spacing w:after="160"/>
+        <w:jc w:val="both"/>
+      </w:pPr>
+      <w:r>
+        <w:rPr>
+          <w:b/>
+          <w:bCs/>
+        </w:rPr>
+        <w:t xml:space="preserve">Sensitivity analyses.</w:t>
+      </w:r>
+      <w:r>
+        <w:t xml:space="preserve"> We assessed the robustness of the main results to the key methodological choices, varying each in turn while all other settings were kept at their primary values. (i) </w:t>
+      </w:r>
+      <w:r>
+        <w:rPr>
+          <w:i/>
+          <w:iCs/>
+        </w:rPr>
+        <w:t xml:space="preserve">Heatwave threshold.</w:t>
+      </w:r>
+      <w:r>
+        <w:t xml:space="preserve"> Heatwaves were also defined with a calendar-day 90th percentile, computed for each calendar day from the 1985-2014 values within a 31-day window centred on that day, which removes the concentration of heatwaves in the hot season inherent to an annual threshold; the three event types, the seasonally constrained null model and the trends were recomputed with this definition (Extended Data Fig. S12). (ii) </w:t>
+      </w:r>
+      <w:r>
+        <w:rPr>
+          <w:i/>
+          <w:iCs/>
+        </w:rPr>
+        <w:t xml:space="preserve">Sequential heatwave-extreme precipitation events.</w:t>
+      </w:r>
+      <w:r>
+        <w:t xml:space="preserve"> The after-to-before ratio was recomputed with windows of ±7, ±15, ±45 and ±60 days instead of ±30 days, to test whether the asymmetry depends on the window length, and after excluding extreme precipitation events within 1 to 5 days of the heatwave boundaries, to test whether it is driven by rainfall that terminates heatwaves (Extended Data Fig. S8a,b; Supplementary Table S4). (iii) </w:t>
+      </w:r>
+      <w:r>
+        <w:rPr>
+          <w:i/>
+          <w:iCs/>
+        </w:rPr>
+        <w:t xml:space="preserve">Drought-preconditioned heatwaves.</w:t>
+      </w:r>
+      <w:r>
+        <w:t xml:space="preserve"> Drought was also taken in the month of heatwave onset (lag 0) instead of the preceding month, defined with the precipitation-only SPI-3 instead of SPEI-3, and defined with thresholds of −0.5, −1.5 and −2 instead of −1; for each variant, we recomputed the share of heatwaves preceded by drought, its trend and the ratio of mean heatwave durations with and without antecedent drought (Extended Data Figs. S8c–e and S10; Supplementary Table S4). (iv) </w:t>
+      </w:r>
+      <w:r>
+        <w:rPr>
+          <w:i/>
+          <w:iCs/>
+        </w:rPr>
+        <w:t xml:space="preserve">Compound-hazard regimes.</w:t>
+      </w:r>
+      <w:r>
+        <w:t xml:space="preserve"> The classification was repeated with the upper tercile instead of the upper quartile as the prominence threshold, and with a minimum of 10 extreme precipitation events and 10 heatwaves with an SPEI-3 value per cluster instead of one (Extended Data Fig. S13). A result is described as robust when its sign and the ranking of sub-regions are unchanged across these variants.</w:t>
       </w:r>
     </w:p>
     <w:p>
@@ -2127,7 +2223,30 @@
           <w:b/>
           <w:bCs/>
         </w:rPr>
-        <w:t xml:space="preserve">Extended Data Fig. S13 | Compound-hazard regimes with the upper tercile as threshold.</w:t>
+        <w:t xml:space="preserve">Extended Data Fig. S13 | Sensitivity of compound-hazard regimes.</w:t>
+      </w:r>
+      <w:r>
+        <w:t xml:space="preserve"> </w:t>
+      </w:r>
+      <w:r>
+        <w:rPr>
+          <w:b/>
+          <w:bCs/>
+        </w:rPr>
+        <w:t xml:space="preserve">a</w:t>
+      </w:r>
+      <w:r>
+        <w:t xml:space="preserve">, Regimes with the upper tercile as prominence threshold. </w:t>
+      </w:r>
+      <w:r>
+        <w:rPr>
+          <w:b/>
+          <w:bCs/>
+        </w:rPr>
+        <w:t xml:space="preserve">b</w:t>
+      </w:r>
+      <w:r>
+        <w:t xml:space="preserve">, Regimes with a minimum of 10 extreme precipitation events and 10 heatwaves with an SPEI-3 value per cluster. Panels as in Fig. 6.</w:t>
       </w:r>
     </w:p>
     <w:p>

</xml_diff>

<commit_message>
Fig 6: locked-file-safe CSV and figure writes; shorter Fig. 6 text and methods
Co-Authored-By: Claude Opus 5.5 <noreply@anthropic.com>
Claude-Session: https://claude.ai/code/session_01MNzwTwnHvzZnQv3nxQibjZ
</commit_message>
<xml_diff>
--- a/compound_pipeline/manuscript/Paper_Dorcas_v3_annual.docx
+++ b/compound_pipeline/manuscript/Paper_Dorcas_v3_annual.docx
@@ -348,16 +348,16 @@
         <w:jc w:val="both"/>
       </w:pPr>
       <w:r>
-        <w:t xml:space="preserve">Classification of PSU by their dominant compound event combinations reveals that most locations across sub-Saharan Africa are exposed to at most one prominent hazard type (Fig. 6). Of the 51,514 locations with sufficient data to be classified (94.3% of the 54,615 clusters; the remaining 5.7% had no extreme precipitation event around heatwaves or no valid climate data), 39.5% had no prominent event type (Fig. 6a), close to the 43.8% expected if the three types were spatially independent. Single-hazard regimes were the most common otherwise: heat-precipitation events alone (17.5%), isolated post-heatwave precipitation excess (16.7%) and drought-heat events alone (14.7%). The combination of drought-heat coupling and post-heatwave precipitation excess represents 6.8%, more than expected under independence (4.8%), consistent with a sequence of dry conditions, heat and subsequent rainfall. By contrast, heat-precipitation events rarely coincide with post-heatwave precipitation excess (1.4%, against 4.2% expected) or with both other types (0.1%, against 1.4% expected), and their pairing with drought-heat coupling represents 3.3%.</w:t>
-      </w:r>
-    </w:p>
-    <w:p>
-      <w:pPr>
-        <w:spacing w:after="160"/>
-        <w:jc w:val="both"/>
-      </w:pPr>
-      <w:r>
-        <w:t xml:space="preserve">These regimes exhibit strong geographical variation (Fig. 6b). Post-heatwave precipitation excess dominates the Sahel, where heatwaves occur at the end of the dry season, and is frequently combined with drought-heat coupling in its western part. Same-day heat-precipitation events dominate in more humid settings, including Madagascar, the East African highlands and the Atlantic coast of Central Africa, and are combined with drought-heat coupling in parts of the Congo Basin and of south-eastern Africa. The near absence of locations where all three types are prominent indicates that these hazards occupy distinct climatic settings rather than accumulating in the same places. With the same 1985-2024 thresholds, the share of locations without any prominent type fell from 64.6% in 1985-1994 to 24.6% in 2015-2024 (Fig. 6c–e). Drought-heat coupling alone became the most frequent regime (from 10.2% to 28.1%), followed by heat-precipitation events alone (7.8% to 23.3%) and their combination (2.2% to 12.4%), whereas post-heatwave precipitation excess alone became less frequent (12.8% to 5.3%). At individual locations, the regime was unchanged in 22.2% of the 42,234 locations classifiable in both decades, barely more than expected by chance (20.5%), so these changes describe a net redistribution rather than stable local trajectories (Fig. 6f). The same patterns were found with the upper tercile as threshold and with a minimum of 10 extreme precipitation events per location (Extended Data Fig. S13).</w:t>
+        <w:t xml:space="preserve">Classification of PSU by their dominant compound event combinations shows that most locations are exposed to at most one prominent hazard type (Fig. 6a). Of the 51,514 classifiable locations (94.3%), 39.5% had no prominent type, and single-hazard regimes were the most common otherwise (heat-precipitation events 17.5%, post-heatwave precipitation excess 16.7%, drought-heat events 14.7%). Drought-heat coupling combined with post-heatwave precipitation excess (6.8%) more often than expected if the three types were spatially independent (4.8%), whereas heat-precipitation events rarely coincided with post-heatwave precipitation excess (1.4%, against 4.2%) or with both other types (0.1%, against 1.4%).</w:t>
+      </w:r>
+    </w:p>
+    <w:p>
+      <w:pPr>
+        <w:spacing w:after="160"/>
+        <w:jc w:val="both"/>
+      </w:pPr>
+      <w:r>
+        <w:t xml:space="preserve">These regimes exhibit strong geographical variation (Fig. 6b): post-heatwave precipitation excess dominates the Sahel, often with drought-heat coupling in its western part, whereas heat-precipitation events dominate more humid regions such as Madagascar, the East African highlands and the Atlantic coast of Central Africa. Between 1985-1994 and 2015-2024, the share of locations without a prominent type fell from 64.6% to 24.6%, mainly towards drought-heat coupling alone (10.2% to 28.1%), heat-precipitation events alone (7.8% to 23.3%) and their combination (2.2% to 12.4%), while post-heatwave precipitation excess alone declined (12.8% to 5.3%) (Fig. 6c–e). Only 22.2% of locations kept the same regime (20.5% expected by chance; Fig. 6f), indicating a net redistribution rather than stable local trajectories. These patterns were robust to the threshold and minimum-support choices (Extended Data Fig. S13).</w:t>
       </w:r>
     </w:p>
     <w:p>
@@ -622,7 +622,7 @@
         <w:t xml:space="preserve">a</w:t>
       </w:r>
       <w:r>
-        <w:t xml:space="preserve">, Distribution of the 51,514 classifiable survey clusters across eight mutually exclusive regimes, defined by which event types are locally prominent (value above the 75th percentile of all classifiable clusters, 1985-2024; Methods). </w:t>
+        <w:t xml:space="preserve">, Distribution of the 51,514 classifiable survey clusters across eight regimes defined by which event types are locally prominent (above the 75th percentile; Methods). </w:t>
       </w:r>
       <w:r>
         <w:rPr>
@@ -632,7 +632,7 @@
         <w:t xml:space="preserve">b</w:t>
       </w:r>
       <w:r>
-        <w:t xml:space="preserve">, Spatial distribution of these regimes; clusters with insufficient data are shown in dark grey. </w:t>
+        <w:t xml:space="preserve">, Spatial distribution; dark grey, insufficient data. </w:t>
       </w:r>
       <w:r>
         <w:rPr>
@@ -642,7 +642,7 @@
         <w:t xml:space="preserve">c</w:t>
       </w:r>
       <w:r>
-        <w:t xml:space="preserve">, Share of each regime by decade, with the 1985-2024 thresholds. </w:t>
+        <w:t xml:space="preserve">, Regime shares by decade. </w:t>
       </w:r>
       <w:r>
         <w:rPr>
@@ -692,7 +692,7 @@
         <w:t xml:space="preserve">f</w:t>
       </w:r>
       <w:r>
-        <w:t xml:space="preserve">, Transitions between the first and last decades for the 42,234 clusters classifiable in both (% of clusters; outlined cells mark unchanged regimes). Categories denote local co-prominence of independently defined metrics and are descriptive; they do not imply physical coupling between event types.</w:t>
+        <w:t xml:space="preserve">, Transitions between these decades (% of 42,234 clusters; outlined cells, unchanged regime). Categories are descriptive and do not imply physical coupling between event types.</w:t>
       </w:r>
     </w:p>
     <w:p>
@@ -818,7 +818,7 @@
         <w:jc w:val="both"/>
       </w:pPr>
       <w:r>
-        <w:t xml:space="preserve">The regional differences observed in these compound events are important for climate-risk assessment. Hazard combinations vary across sub-Saharan Africa: post-heatwave precipitation excess, often together with drought-heat coupling, characterizes the Sahel, whereas same-day heat-precipitation events characterize more humid regions such as Madagascar and the East African highlands, and the three types almost never coincide at the same location. The rapid expansion of regimes dominated by drought-heat coupling and heat-precipitation co-occurrence over the past four decades shows that exposure is changing in type as well as in frequency. This diversity indicates that climate risks cannot be fully understood by considering hazards in isolation.</w:t>
+        <w:t xml:space="preserve">The regional differences observed in these compound events are important for climate-risk assessment. Hazard combinations differ between the Sahel, where extreme rainfall follows heatwaves, and more humid regions, where it accompanies them, and they are shifting towards drought-heat and heat-precipitation regimes. This diversity indicates that climate risks cannot be fully understood by considering hazards in isolation.</w:t>
       </w:r>
     </w:p>
     <w:p>
@@ -1297,7 +1297,7 @@
         <w:t xml:space="preserve">Compound-hazard regimes.</w:t>
       </w:r>
       <w:r>
-        <w:t xml:space="preserve"> Because the three event types are measured in different units (days per year, a ratio and a percentage), locations were classified with a relative rule rather than with absolute thresholds, which preserves comparability across event types. For each type, a PSU was considered prominent when its 1985-2024 value was strictly above the 75th percentile of all classifiable PSUs, so that each type is prominent in about one quarter of locations; the three outcomes define eight mutually exclusive regimes. For the sequential type, the after-to-before ratio was computed with 0.5 added to both counts (Haldane-Anscombe correction), so that it remains defined where no extreme precipitation preceded heatwaves and is not inflated where events are very few. PSUs without any extreme precipitation event around heatwaves, or without a heatwave with an SPEI-3 value, were labelled as having insufficient data. The share of each regime was compared with its expectation if the three types were spatially independent, computed as the product of the observed shares of prominent or non-prominent PSUs for each type. Decadal regimes apply the same 1985-2024 thresholds, so that changes reflect changes in the underlying metrics; transitions between the first and last decades were computed on the PSUs classifiable in both, and the share of PSUs keeping the same regime was compared with its value expected by chance. The classification is descriptive and does not imply physical coupling between event types.</w:t>
+        <w:t xml:space="preserve"> Because the three metrics have different units, a relative rule was used: an event type was prominent in a PSU when its 1985-2024 value was strictly above the 75th percentile of all classifiable PSUs, giving eight mutually exclusive regimes. The after-to-before ratio was computed with 0.5 added to both counts (Haldane-Anscombe correction), so that it is defined where no EPE preceded heatwaves; PSUs without any EPE around heatwaves or without an SPEI-3 value were labelled as having insufficient data. Regime shares were compared with their expectation under spatial independence (product of the per-type shares of prominent PSUs). Decadal regimes use the same thresholds; transitions between the first and last decades were computed on the PSUs classifiable in both and compared with chance.</w:t>
       </w:r>
     </w:p>
     <w:p>
@@ -1313,47 +1313,7 @@
         <w:t xml:space="preserve">Sensitivity analyses.</w:t>
       </w:r>
       <w:r>
-        <w:t xml:space="preserve"> We assessed the robustness of the main results to the key methodological choices, varying each in turn while all other settings were kept at their primary values. (i) </w:t>
-      </w:r>
-      <w:r>
-        <w:rPr>
-          <w:i/>
-          <w:iCs/>
-        </w:rPr>
-        <w:t xml:space="preserve">Heatwave threshold.</w:t>
-      </w:r>
-      <w:r>
-        <w:t xml:space="preserve"> Heatwaves were also defined with a calendar-day 90th percentile, computed for each calendar day from the 1985-2014 values within a 31-day window centred on that day, which removes the concentration of heatwaves in the hot season inherent to an annual threshold; the three event types, the seasonally constrained null model and the trends were recomputed with this definition (Extended Data Fig. S12). (ii) </w:t>
-      </w:r>
-      <w:r>
-        <w:rPr>
-          <w:i/>
-          <w:iCs/>
-        </w:rPr>
-        <w:t xml:space="preserve">Sequential heatwave-extreme precipitation events.</w:t>
-      </w:r>
-      <w:r>
-        <w:t xml:space="preserve"> The after-to-before ratio was recomputed with windows of ±7, ±15, ±45 and ±60 days instead of ±30 days, to test whether the asymmetry depends on the window length, and after excluding extreme precipitation events within 1 to 5 days of the heatwave boundaries, to test whether it is driven by rainfall that terminates heatwaves (Extended Data Fig. S8a,b; Supplementary Table S4). (iii) </w:t>
-      </w:r>
-      <w:r>
-        <w:rPr>
-          <w:i/>
-          <w:iCs/>
-        </w:rPr>
-        <w:t xml:space="preserve">Drought-preconditioned heatwaves.</w:t>
-      </w:r>
-      <w:r>
-        <w:t xml:space="preserve"> Drought was also taken in the month of heatwave onset (lag 0) instead of the preceding month, defined with the precipitation-only SPI-3 instead of SPEI-3, and defined with thresholds of −0.5, −1.5 and −2 instead of −1; for each variant, we recomputed the share of heatwaves preceded by drought, its trend and the ratio of mean heatwave durations with and without antecedent drought (Extended Data Figs. S8c–e and S10; Supplementary Table S4). (iv) </w:t>
-      </w:r>
-      <w:r>
-        <w:rPr>
-          <w:i/>
-          <w:iCs/>
-        </w:rPr>
-        <w:t xml:space="preserve">Compound-hazard regimes.</w:t>
-      </w:r>
-      <w:r>
-        <w:t xml:space="preserve"> The classification was repeated with the upper tercile instead of the upper quartile as the prominence threshold, and with a minimum of 10 extreme precipitation events and 10 heatwaves with an SPEI-3 value per cluster instead of one (Extended Data Fig. S13). A result is described as robust when its sign and the ranking of sub-regions are unchanged across these variants.</w:t>
+        <w:t xml:space="preserve"> Each key choice was varied in turn, all other settings unchanged: (i) a calendar-day heatwave threshold (90th percentile of the 1985-2014 values in a 31-day window centred on each calendar day), with the three event types, the null model and the trends recomputed (Extended Data Fig. S12); (ii) windows of ±7 to ±60 days, and the exclusion of EPEs within 1 to 5 days of the heatwave boundaries, for the after-to-before ratio (Extended Data Fig. S8a,b; Supplementary Table S4); (iii) drought taken in the onset month (lag 0), defined with SPI-3, or with thresholds of −0.5, −1.5 and −2 (Extended Data Figs. S8c–e and S10; Supplementary Table S4); (iv) the upper tercile as regime threshold and a minimum of 10 EPEs and 10 heatwaves with an SPEI-3 value per cluster (Extended Data Fig. S13).</w:t>
       </w:r>
     </w:p>
     <w:p>

</xml_diff>

<commit_message>
Methods: CHIRPS at 0.25 deg, SPI fit method stated
Co-Authored-By: Claude Opus 5.5 <noreply@anthropic.com>
Claude-Session: https://claude.ai/code/session_01MNzwTwnHvzZnQv3nxQibjZ
</commit_message>
<xml_diff>
--- a/compound_pipeline/manuscript/Paper_Dorcas_v3_annual.docx
+++ b/compound_pipeline/manuscript/Paper_Dorcas_v3_annual.docx
@@ -899,7 +899,7 @@
         <w:t xml:space="preserve">24</w:t>
       </w:r>
       <w:r>
-        <w:t xml:space="preserve">. This spatial jittering is negligible relative to the 0.25° grid spacing (≈28 km at the equator) of the temperature data employed here.</w:t>
+        <w:t xml:space="preserve">. This spatial jittering is negligible relative to the 0.25° grid spacing (≈28 km at the equator) of the climate data employed here.</w:t>
       </w:r>
     </w:p>
     <w:p>
@@ -944,7 +944,7 @@
         <w:t xml:space="preserve">34</w:t>
       </w:r>
       <w:r>
-        <w:t xml:space="preserve"> at 0.05° resolution over the same period. For each PSU, daily values were extracted from the nearest grid cell of each product; a match was rejected when the cell centre lay more than 20 km away or when the cell contained no valid data. All PSUs had a valid ERA5 cell and 53,802 a valid CHIRPS cell; the extreme-precipitation threshold additionally required at least 100 wet days in the reference period, so that analyses involving extreme precipitation use 53,782 PSUs and drought analyses 53,802 PSUs. ERA5 and CHIRPS were selected because they provide continuous continental-scale coverage across sub-Saharan Africa, have undergone extensive regional validation, and offer the spatio-temporal resolution necessary to reliably detect co-occurring climate extremes.</w:t>
+        <w:t xml:space="preserve"> at 0.25° resolution over the same period. For each PSU, daily values were extracted from the nearest grid cell of each product; a match was rejected when the cell centre lay more than 20 km away or when the cell contained no valid data. All PSUs had a valid ERA5 cell and 53,802 a valid CHIRPS cell; the extreme-precipitation threshold additionally required at least 100 wet days in the reference period, so that analyses involving extreme precipitation use 53,782 PSUs and drought analyses 53,802 PSUs. ERA5 and CHIRPS were selected because they provide continuous continental-scale coverage across sub-Saharan Africa, have undergone extensive regional validation, and offer the spatio-temporal resolution necessary to reliably detect co-occurring climate extremes.</w:t>
       </w:r>
     </w:p>
     <w:p>
@@ -1104,7 +1104,7 @@
         <w:t xml:space="preserve">41</w:t>
       </w:r>
       <w:r>
-        <w:t xml:space="preserve">, based on precipitation only, was computed in the same way with a gamma distribution. A PSU-month was classified as experiencing drought when the index was below −1, corresponding to at least moderate drought severity</w:t>
+        <w:t xml:space="preserve">, based on precipitation only, was computed with a gamma distribution (xclim approximate method) over the same calibration period and with the same clipping. A PSU-month was classified as experiencing drought when the index was below −1, corresponding to at least moderate drought severity</w:t>
       </w:r>
       <w:r>
         <w:rPr>

</xml_diff>

<commit_message>
Fig 6 redesigned for legibility; sensitivity panel b legend moved
Co-Authored-By: Claude Opus 5.5 <noreply@anthropic.com>
Claude-Session: https://claude.ai/code/session_01MNzwTwnHvzZnQv3nxQibjZ
</commit_message>
<xml_diff>
--- a/compound_pipeline/manuscript/Paper_Dorcas_v3_annual.docx
+++ b/compound_pipeline/manuscript/Paper_Dorcas_v3_annual.docx
@@ -622,7 +622,7 @@
         <w:t xml:space="preserve">a</w:t>
       </w:r>
       <w:r>
-        <w:t xml:space="preserve">, Distribution of the 51,514 classifiable survey clusters across eight regimes defined by which event types are locally prominent (above the 75th percentile; Methods). </w:t>
+        <w:t xml:space="preserve">, Share (%) of the 51,514 classifiable survey clusters in each of eight regimes defined by which event types are locally prominent (above the 75th percentile; Methods). </w:t>
       </w:r>
       <w:r>
         <w:rPr>
@@ -692,7 +692,7 @@
         <w:t xml:space="preserve">f</w:t>
       </w:r>
       <w:r>
-        <w:t xml:space="preserve">, Transitions between these decades (% of 42,234 clusters; outlined cells, unchanged regime). Categories are descriptive and do not imply physical coupling between event types.</w:t>
+        <w:t xml:space="preserve">, Transitions between these decades (% of the 42,234 clusters classifiable in both; outlined cells, unchanged regime). HP, heat-precipitation events; PH, post-heatwave precipitation excess; DH, drought-heat coupling. Categories are descriptive and do not imply physical coupling between event types.</w:t>
       </w:r>
     </w:p>
     <w:p>

</xml_diff>